<commit_message>
Werk handleiding en projectbeschrijving bij voor de nieuwe functies
Handleiding: bestandsnaam in de kop, kader "Even geduld" over de
bezig-melding, Undo tot 20 stappen + nieuwe Redo-knop en sneltoetsen,
aangepast kader "Erase is blijvend", exporttekst met teller, nieuwe
probleemregel, en nieuwe schermafbeeldingen van het correctiescherm en
de werkbalk (verzonnen kantoorplattegrond).

PROJECT_SPEC.md: Undo/Redo-geschiedenis, bezig-melding en bestandsnaam,
en de versnelling van de opschoning zonder CAD-lagen.

Co-Authored-By: Claude Opus 5.5 <noreply@anthropic.com>
</commit_message>
<xml_diff>
--- a/docs/Floorplan Cleaner Handleiding.docx
+++ b/docs/Floorplan Cleaner Handleiding.docx
@@ -140,11 +140,7 @@
           </w:pPr>
           <w:r>
             <w:fldChar w:fldCharType="begin"/>
-          </w:r>
-          <w:r>
             <w:instrText>TOC \h \o "1-2"</w:instrText>
-          </w:r>
-          <w:r>
             <w:fldChar w:fldCharType="separate"/>
           </w:r>
           <w:hyperlink w:anchor="_Toc242623948" w:history="1">
@@ -160,40 +156,10 @@
                 <w:noProof/>
               </w:rPr>
               <w:tab/>
-            </w:r>
-            <w:r>
-              <w:rPr>
-                <w:noProof/>
-              </w:rPr>
               <w:fldChar w:fldCharType="begin"/>
-            </w:r>
-            <w:r>
-              <w:rPr>
-                <w:noProof/>
-              </w:rPr>
               <w:instrText xml:space="preserve"> PAGEREF _Toc242623948 \h </w:instrText>
-            </w:r>
-            <w:r>
-              <w:rPr>
-                <w:noProof/>
-              </w:rPr>
-            </w:r>
-            <w:r>
-              <w:rPr>
-                <w:noProof/>
-              </w:rPr>
               <w:fldChar w:fldCharType="separate"/>
-            </w:r>
-            <w:r>
-              <w:rPr>
-                <w:noProof/>
-              </w:rPr>
               <w:t>4</w:t>
-            </w:r>
-            <w:r>
-              <w:rPr>
-                <w:noProof/>
-              </w:rPr>
               <w:fldChar w:fldCharType="end"/>
             </w:r>
           </w:hyperlink>
@@ -227,40 +193,10 @@
                 <w:noProof/>
               </w:rPr>
               <w:tab/>
-            </w:r>
-            <w:r>
-              <w:rPr>
-                <w:noProof/>
-              </w:rPr>
               <w:fldChar w:fldCharType="begin"/>
-            </w:r>
-            <w:r>
-              <w:rPr>
-                <w:noProof/>
-              </w:rPr>
               <w:instrText xml:space="preserve"> PAGEREF _Toc242623949 \h </w:instrText>
-            </w:r>
-            <w:r>
-              <w:rPr>
-                <w:noProof/>
-              </w:rPr>
-            </w:r>
-            <w:r>
-              <w:rPr>
-                <w:noProof/>
-              </w:rPr>
               <w:fldChar w:fldCharType="separate"/>
-            </w:r>
-            <w:r>
-              <w:rPr>
-                <w:noProof/>
-              </w:rPr>
               <w:t>4</w:t>
-            </w:r>
-            <w:r>
-              <w:rPr>
-                <w:noProof/>
-              </w:rPr>
               <w:fldChar w:fldCharType="end"/>
             </w:r>
           </w:hyperlink>
@@ -294,40 +230,10 @@
                 <w:noProof/>
               </w:rPr>
               <w:tab/>
-            </w:r>
-            <w:r>
-              <w:rPr>
-                <w:noProof/>
-              </w:rPr>
               <w:fldChar w:fldCharType="begin"/>
-            </w:r>
-            <w:r>
-              <w:rPr>
-                <w:noProof/>
-              </w:rPr>
               <w:instrText xml:space="preserve"> PAGEREF _Toc242623950 \h </w:instrText>
-            </w:r>
-            <w:r>
-              <w:rPr>
-                <w:noProof/>
-              </w:rPr>
-            </w:r>
-            <w:r>
-              <w:rPr>
-                <w:noProof/>
-              </w:rPr>
               <w:fldChar w:fldCharType="separate"/>
-            </w:r>
-            <w:r>
-              <w:rPr>
-                <w:noProof/>
-              </w:rPr>
               <w:t>5</w:t>
-            </w:r>
-            <w:r>
-              <w:rPr>
-                <w:noProof/>
-              </w:rPr>
               <w:fldChar w:fldCharType="end"/>
             </w:r>
           </w:hyperlink>
@@ -361,40 +267,10 @@
                 <w:noProof/>
               </w:rPr>
               <w:tab/>
-            </w:r>
-            <w:r>
-              <w:rPr>
-                <w:noProof/>
-              </w:rPr>
               <w:fldChar w:fldCharType="begin"/>
-            </w:r>
-            <w:r>
-              <w:rPr>
-                <w:noProof/>
-              </w:rPr>
               <w:instrText xml:space="preserve"> PAGEREF _Toc242623951 \h </w:instrText>
-            </w:r>
-            <w:r>
-              <w:rPr>
-                <w:noProof/>
-              </w:rPr>
-            </w:r>
-            <w:r>
-              <w:rPr>
-                <w:noProof/>
-              </w:rPr>
               <w:fldChar w:fldCharType="separate"/>
-            </w:r>
-            <w:r>
-              <w:rPr>
-                <w:noProof/>
-              </w:rPr>
               <w:t>5</w:t>
-            </w:r>
-            <w:r>
-              <w:rPr>
-                <w:noProof/>
-              </w:rPr>
               <w:fldChar w:fldCharType="end"/>
             </w:r>
           </w:hyperlink>
@@ -428,40 +304,10 @@
                 <w:noProof/>
               </w:rPr>
               <w:tab/>
-            </w:r>
-            <w:r>
-              <w:rPr>
-                <w:noProof/>
-              </w:rPr>
               <w:fldChar w:fldCharType="begin"/>
-            </w:r>
-            <w:r>
-              <w:rPr>
-                <w:noProof/>
-              </w:rPr>
               <w:instrText xml:space="preserve"> PAGEREF _Toc242623952 \h </w:instrText>
-            </w:r>
-            <w:r>
-              <w:rPr>
-                <w:noProof/>
-              </w:rPr>
-            </w:r>
-            <w:r>
-              <w:rPr>
-                <w:noProof/>
-              </w:rPr>
               <w:fldChar w:fldCharType="separate"/>
-            </w:r>
-            <w:r>
-              <w:rPr>
-                <w:noProof/>
-              </w:rPr>
               <w:t>6</w:t>
-            </w:r>
-            <w:r>
-              <w:rPr>
-                <w:noProof/>
-              </w:rPr>
               <w:fldChar w:fldCharType="end"/>
             </w:r>
           </w:hyperlink>
@@ -495,40 +341,10 @@
                 <w:noProof/>
               </w:rPr>
               <w:tab/>
-            </w:r>
-            <w:r>
-              <w:rPr>
-                <w:noProof/>
-              </w:rPr>
               <w:fldChar w:fldCharType="begin"/>
-            </w:r>
-            <w:r>
-              <w:rPr>
-                <w:noProof/>
-              </w:rPr>
               <w:instrText xml:space="preserve"> PAGEREF _Toc242623953 \h </w:instrText>
-            </w:r>
-            <w:r>
-              <w:rPr>
-                <w:noProof/>
-              </w:rPr>
-            </w:r>
-            <w:r>
-              <w:rPr>
-                <w:noProof/>
-              </w:rPr>
               <w:fldChar w:fldCharType="separate"/>
-            </w:r>
-            <w:r>
-              <w:rPr>
-                <w:noProof/>
-              </w:rPr>
               <w:t>6</w:t>
-            </w:r>
-            <w:r>
-              <w:rPr>
-                <w:noProof/>
-              </w:rPr>
               <w:fldChar w:fldCharType="end"/>
             </w:r>
           </w:hyperlink>
@@ -562,40 +378,10 @@
                 <w:noProof/>
               </w:rPr>
               <w:tab/>
-            </w:r>
-            <w:r>
-              <w:rPr>
-                <w:noProof/>
-              </w:rPr>
               <w:fldChar w:fldCharType="begin"/>
-            </w:r>
-            <w:r>
-              <w:rPr>
-                <w:noProof/>
-              </w:rPr>
               <w:instrText xml:space="preserve"> PAGEREF _Toc242623954 \h </w:instrText>
-            </w:r>
-            <w:r>
-              <w:rPr>
-                <w:noProof/>
-              </w:rPr>
-            </w:r>
-            <w:r>
-              <w:rPr>
-                <w:noProof/>
-              </w:rPr>
               <w:fldChar w:fldCharType="separate"/>
-            </w:r>
-            <w:r>
-              <w:rPr>
-                <w:noProof/>
-              </w:rPr>
               <w:t>6</w:t>
-            </w:r>
-            <w:r>
-              <w:rPr>
-                <w:noProof/>
-              </w:rPr>
               <w:fldChar w:fldCharType="end"/>
             </w:r>
           </w:hyperlink>
@@ -629,40 +415,10 @@
                 <w:noProof/>
               </w:rPr>
               <w:tab/>
-            </w:r>
-            <w:r>
-              <w:rPr>
-                <w:noProof/>
-              </w:rPr>
               <w:fldChar w:fldCharType="begin"/>
-            </w:r>
-            <w:r>
-              <w:rPr>
-                <w:noProof/>
-              </w:rPr>
               <w:instrText xml:space="preserve"> PAGEREF _Toc242623955 \h </w:instrText>
-            </w:r>
-            <w:r>
-              <w:rPr>
-                <w:noProof/>
-              </w:rPr>
-            </w:r>
-            <w:r>
-              <w:rPr>
-                <w:noProof/>
-              </w:rPr>
               <w:fldChar w:fldCharType="separate"/>
-            </w:r>
-            <w:r>
-              <w:rPr>
-                <w:noProof/>
-              </w:rPr>
               <w:t>6</w:t>
-            </w:r>
-            <w:r>
-              <w:rPr>
-                <w:noProof/>
-              </w:rPr>
               <w:fldChar w:fldCharType="end"/>
             </w:r>
           </w:hyperlink>
@@ -696,40 +452,10 @@
                 <w:noProof/>
               </w:rPr>
               <w:tab/>
-            </w:r>
-            <w:r>
-              <w:rPr>
-                <w:noProof/>
-              </w:rPr>
               <w:fldChar w:fldCharType="begin"/>
-            </w:r>
-            <w:r>
-              <w:rPr>
-                <w:noProof/>
-              </w:rPr>
               <w:instrText xml:space="preserve"> PAGEREF _Toc242623956 \h </w:instrText>
-            </w:r>
-            <w:r>
-              <w:rPr>
-                <w:noProof/>
-              </w:rPr>
-            </w:r>
-            <w:r>
-              <w:rPr>
-                <w:noProof/>
-              </w:rPr>
               <w:fldChar w:fldCharType="separate"/>
-            </w:r>
-            <w:r>
-              <w:rPr>
-                <w:noProof/>
-              </w:rPr>
               <w:t>6</w:t>
-            </w:r>
-            <w:r>
-              <w:rPr>
-                <w:noProof/>
-              </w:rPr>
               <w:fldChar w:fldCharType="end"/>
             </w:r>
           </w:hyperlink>
@@ -763,40 +489,10 @@
                 <w:noProof/>
               </w:rPr>
               <w:tab/>
-            </w:r>
-            <w:r>
-              <w:rPr>
-                <w:noProof/>
-              </w:rPr>
               <w:fldChar w:fldCharType="begin"/>
-            </w:r>
-            <w:r>
-              <w:rPr>
-                <w:noProof/>
-              </w:rPr>
               <w:instrText xml:space="preserve"> PAGEREF _Toc242623957 \h </w:instrText>
-            </w:r>
-            <w:r>
-              <w:rPr>
-                <w:noProof/>
-              </w:rPr>
-            </w:r>
-            <w:r>
-              <w:rPr>
-                <w:noProof/>
-              </w:rPr>
               <w:fldChar w:fldCharType="separate"/>
-            </w:r>
-            <w:r>
-              <w:rPr>
-                <w:noProof/>
-              </w:rPr>
               <w:t>7</w:t>
-            </w:r>
-            <w:r>
-              <w:rPr>
-                <w:noProof/>
-              </w:rPr>
               <w:fldChar w:fldCharType="end"/>
             </w:r>
           </w:hyperlink>
@@ -830,40 +526,10 @@
                 <w:noProof/>
               </w:rPr>
               <w:tab/>
-            </w:r>
-            <w:r>
-              <w:rPr>
-                <w:noProof/>
-              </w:rPr>
               <w:fldChar w:fldCharType="begin"/>
-            </w:r>
-            <w:r>
-              <w:rPr>
-                <w:noProof/>
-              </w:rPr>
               <w:instrText xml:space="preserve"> PAGEREF _Toc242623958 \h </w:instrText>
-            </w:r>
-            <w:r>
-              <w:rPr>
-                <w:noProof/>
-              </w:rPr>
-            </w:r>
-            <w:r>
-              <w:rPr>
-                <w:noProof/>
-              </w:rPr>
               <w:fldChar w:fldCharType="separate"/>
-            </w:r>
-            <w:r>
-              <w:rPr>
-                <w:noProof/>
-              </w:rPr>
               <w:t>7</w:t>
-            </w:r>
-            <w:r>
-              <w:rPr>
-                <w:noProof/>
-              </w:rPr>
               <w:fldChar w:fldCharType="end"/>
             </w:r>
           </w:hyperlink>
@@ -897,40 +563,10 @@
                 <w:noProof/>
               </w:rPr>
               <w:tab/>
-            </w:r>
-            <w:r>
-              <w:rPr>
-                <w:noProof/>
-              </w:rPr>
               <w:fldChar w:fldCharType="begin"/>
-            </w:r>
-            <w:r>
-              <w:rPr>
-                <w:noProof/>
-              </w:rPr>
               <w:instrText xml:space="preserve"> PAGEREF _Toc242623959 \h </w:instrText>
-            </w:r>
-            <w:r>
-              <w:rPr>
-                <w:noProof/>
-              </w:rPr>
-            </w:r>
-            <w:r>
-              <w:rPr>
-                <w:noProof/>
-              </w:rPr>
               <w:fldChar w:fldCharType="separate"/>
-            </w:r>
-            <w:r>
-              <w:rPr>
-                <w:noProof/>
-              </w:rPr>
               <w:t>8</w:t>
-            </w:r>
-            <w:r>
-              <w:rPr>
-                <w:noProof/>
-              </w:rPr>
               <w:fldChar w:fldCharType="end"/>
             </w:r>
           </w:hyperlink>
@@ -964,40 +600,10 @@
                 <w:noProof/>
               </w:rPr>
               <w:tab/>
-            </w:r>
-            <w:r>
-              <w:rPr>
-                <w:noProof/>
-              </w:rPr>
               <w:fldChar w:fldCharType="begin"/>
-            </w:r>
-            <w:r>
-              <w:rPr>
-                <w:noProof/>
-              </w:rPr>
               <w:instrText xml:space="preserve"> PAGEREF _Toc242623960 \h </w:instrText>
-            </w:r>
-            <w:r>
-              <w:rPr>
-                <w:noProof/>
-              </w:rPr>
-            </w:r>
-            <w:r>
-              <w:rPr>
-                <w:noProof/>
-              </w:rPr>
               <w:fldChar w:fldCharType="separate"/>
-            </w:r>
-            <w:r>
-              <w:rPr>
-                <w:noProof/>
-              </w:rPr>
               <w:t>8</w:t>
-            </w:r>
-            <w:r>
-              <w:rPr>
-                <w:noProof/>
-              </w:rPr>
               <w:fldChar w:fldCharType="end"/>
             </w:r>
           </w:hyperlink>
@@ -1031,40 +637,10 @@
                 <w:noProof/>
               </w:rPr>
               <w:tab/>
-            </w:r>
-            <w:r>
-              <w:rPr>
-                <w:noProof/>
-              </w:rPr>
               <w:fldChar w:fldCharType="begin"/>
-            </w:r>
-            <w:r>
-              <w:rPr>
-                <w:noProof/>
-              </w:rPr>
               <w:instrText xml:space="preserve"> PAGEREF _Toc242623961 \h </w:instrText>
-            </w:r>
-            <w:r>
-              <w:rPr>
-                <w:noProof/>
-              </w:rPr>
-            </w:r>
-            <w:r>
-              <w:rPr>
-                <w:noProof/>
-              </w:rPr>
               <w:fldChar w:fldCharType="separate"/>
-            </w:r>
-            <w:r>
-              <w:rPr>
-                <w:noProof/>
-              </w:rPr>
               <w:t>8</w:t>
-            </w:r>
-            <w:r>
-              <w:rPr>
-                <w:noProof/>
-              </w:rPr>
               <w:fldChar w:fldCharType="end"/>
             </w:r>
           </w:hyperlink>
@@ -1098,40 +674,10 @@
                 <w:noProof/>
               </w:rPr>
               <w:tab/>
-            </w:r>
-            <w:r>
-              <w:rPr>
-                <w:noProof/>
-              </w:rPr>
               <w:fldChar w:fldCharType="begin"/>
-            </w:r>
-            <w:r>
-              <w:rPr>
-                <w:noProof/>
-              </w:rPr>
               <w:instrText xml:space="preserve"> PAGEREF _Toc242623962 \h </w:instrText>
-            </w:r>
-            <w:r>
-              <w:rPr>
-                <w:noProof/>
-              </w:rPr>
-            </w:r>
-            <w:r>
-              <w:rPr>
-                <w:noProof/>
-              </w:rPr>
               <w:fldChar w:fldCharType="separate"/>
-            </w:r>
-            <w:r>
-              <w:rPr>
-                <w:noProof/>
-              </w:rPr>
               <w:t>8</w:t>
-            </w:r>
-            <w:r>
-              <w:rPr>
-                <w:noProof/>
-              </w:rPr>
               <w:fldChar w:fldCharType="end"/>
             </w:r>
           </w:hyperlink>
@@ -1165,40 +711,10 @@
                 <w:noProof/>
               </w:rPr>
               <w:tab/>
-            </w:r>
-            <w:r>
-              <w:rPr>
-                <w:noProof/>
-              </w:rPr>
               <w:fldChar w:fldCharType="begin"/>
-            </w:r>
-            <w:r>
-              <w:rPr>
-                <w:noProof/>
-              </w:rPr>
               <w:instrText xml:space="preserve"> PAGEREF _Toc242623963 \h </w:instrText>
-            </w:r>
-            <w:r>
-              <w:rPr>
-                <w:noProof/>
-              </w:rPr>
-            </w:r>
-            <w:r>
-              <w:rPr>
-                <w:noProof/>
-              </w:rPr>
               <w:fldChar w:fldCharType="separate"/>
-            </w:r>
-            <w:r>
-              <w:rPr>
-                <w:noProof/>
-              </w:rPr>
               <w:t>8</w:t>
-            </w:r>
-            <w:r>
-              <w:rPr>
-                <w:noProof/>
-              </w:rPr>
               <w:fldChar w:fldCharType="end"/>
             </w:r>
           </w:hyperlink>
@@ -1232,40 +748,10 @@
                 <w:noProof/>
               </w:rPr>
               <w:tab/>
-            </w:r>
-            <w:r>
-              <w:rPr>
-                <w:noProof/>
-              </w:rPr>
               <w:fldChar w:fldCharType="begin"/>
-            </w:r>
-            <w:r>
-              <w:rPr>
-                <w:noProof/>
-              </w:rPr>
               <w:instrText xml:space="preserve"> PAGEREF _Toc242623964 \h </w:instrText>
-            </w:r>
-            <w:r>
-              <w:rPr>
-                <w:noProof/>
-              </w:rPr>
-            </w:r>
-            <w:r>
-              <w:rPr>
-                <w:noProof/>
-              </w:rPr>
               <w:fldChar w:fldCharType="separate"/>
-            </w:r>
-            <w:r>
-              <w:rPr>
-                <w:noProof/>
-              </w:rPr>
               <w:t>9</w:t>
-            </w:r>
-            <w:r>
-              <w:rPr>
-                <w:noProof/>
-              </w:rPr>
               <w:fldChar w:fldCharType="end"/>
             </w:r>
           </w:hyperlink>
@@ -1299,40 +785,10 @@
                 <w:noProof/>
               </w:rPr>
               <w:tab/>
-            </w:r>
-            <w:r>
-              <w:rPr>
-                <w:noProof/>
-              </w:rPr>
               <w:fldChar w:fldCharType="begin"/>
-            </w:r>
-            <w:r>
-              <w:rPr>
-                <w:noProof/>
-              </w:rPr>
               <w:instrText xml:space="preserve"> PAGEREF _Toc242623965 \h </w:instrText>
-            </w:r>
-            <w:r>
-              <w:rPr>
-                <w:noProof/>
-              </w:rPr>
-            </w:r>
-            <w:r>
-              <w:rPr>
-                <w:noProof/>
-              </w:rPr>
               <w:fldChar w:fldCharType="separate"/>
-            </w:r>
-            <w:r>
-              <w:rPr>
-                <w:noProof/>
-              </w:rPr>
               <w:t>9</w:t>
-            </w:r>
-            <w:r>
-              <w:rPr>
-                <w:noProof/>
-              </w:rPr>
               <w:fldChar w:fldCharType="end"/>
             </w:r>
           </w:hyperlink>
@@ -1366,40 +822,10 @@
                 <w:noProof/>
               </w:rPr>
               <w:tab/>
-            </w:r>
-            <w:r>
-              <w:rPr>
-                <w:noProof/>
-              </w:rPr>
               <w:fldChar w:fldCharType="begin"/>
-            </w:r>
-            <w:r>
-              <w:rPr>
-                <w:noProof/>
-              </w:rPr>
               <w:instrText xml:space="preserve"> PAGEREF _Toc242623966 \h </w:instrText>
-            </w:r>
-            <w:r>
-              <w:rPr>
-                <w:noProof/>
-              </w:rPr>
-            </w:r>
-            <w:r>
-              <w:rPr>
-                <w:noProof/>
-              </w:rPr>
               <w:fldChar w:fldCharType="separate"/>
-            </w:r>
-            <w:r>
-              <w:rPr>
-                <w:noProof/>
-              </w:rPr>
               <w:t>10</w:t>
-            </w:r>
-            <w:r>
-              <w:rPr>
-                <w:noProof/>
-              </w:rPr>
               <w:fldChar w:fldCharType="end"/>
             </w:r>
           </w:hyperlink>
@@ -1433,40 +859,10 @@
                 <w:noProof/>
               </w:rPr>
               <w:tab/>
-            </w:r>
-            <w:r>
-              <w:rPr>
-                <w:noProof/>
-              </w:rPr>
               <w:fldChar w:fldCharType="begin"/>
-            </w:r>
-            <w:r>
-              <w:rPr>
-                <w:noProof/>
-              </w:rPr>
               <w:instrText xml:space="preserve"> PAGEREF _Toc242623967 \h </w:instrText>
-            </w:r>
-            <w:r>
-              <w:rPr>
-                <w:noProof/>
-              </w:rPr>
-            </w:r>
-            <w:r>
-              <w:rPr>
-                <w:noProof/>
-              </w:rPr>
               <w:fldChar w:fldCharType="separate"/>
-            </w:r>
-            <w:r>
-              <w:rPr>
-                <w:noProof/>
-              </w:rPr>
               <w:t>10</w:t>
-            </w:r>
-            <w:r>
-              <w:rPr>
-                <w:noProof/>
-              </w:rPr>
               <w:fldChar w:fldCharType="end"/>
             </w:r>
           </w:hyperlink>
@@ -1500,40 +896,10 @@
                 <w:noProof/>
               </w:rPr>
               <w:tab/>
-            </w:r>
-            <w:r>
-              <w:rPr>
-                <w:noProof/>
-              </w:rPr>
               <w:fldChar w:fldCharType="begin"/>
-            </w:r>
-            <w:r>
-              <w:rPr>
-                <w:noProof/>
-              </w:rPr>
               <w:instrText xml:space="preserve"> PAGEREF _Toc242623968 \h </w:instrText>
-            </w:r>
-            <w:r>
-              <w:rPr>
-                <w:noProof/>
-              </w:rPr>
-            </w:r>
-            <w:r>
-              <w:rPr>
-                <w:noProof/>
-              </w:rPr>
               <w:fldChar w:fldCharType="separate"/>
-            </w:r>
-            <w:r>
-              <w:rPr>
-                <w:noProof/>
-              </w:rPr>
               <w:t>10</w:t>
-            </w:r>
-            <w:r>
-              <w:rPr>
-                <w:noProof/>
-              </w:rPr>
               <w:fldChar w:fldCharType="end"/>
             </w:r>
           </w:hyperlink>
@@ -1567,40 +933,10 @@
                 <w:noProof/>
               </w:rPr>
               <w:tab/>
-            </w:r>
-            <w:r>
-              <w:rPr>
-                <w:noProof/>
-              </w:rPr>
               <w:fldChar w:fldCharType="begin"/>
-            </w:r>
-            <w:r>
-              <w:rPr>
-                <w:noProof/>
-              </w:rPr>
               <w:instrText xml:space="preserve"> PAGEREF _Toc242623969 \h </w:instrText>
-            </w:r>
-            <w:r>
-              <w:rPr>
-                <w:noProof/>
-              </w:rPr>
-            </w:r>
-            <w:r>
-              <w:rPr>
-                <w:noProof/>
-              </w:rPr>
               <w:fldChar w:fldCharType="separate"/>
-            </w:r>
-            <w:r>
-              <w:rPr>
-                <w:noProof/>
-              </w:rPr>
               <w:t>10</w:t>
-            </w:r>
-            <w:r>
-              <w:rPr>
-                <w:noProof/>
-              </w:rPr>
               <w:fldChar w:fldCharType="end"/>
             </w:r>
           </w:hyperlink>
@@ -1634,40 +970,10 @@
                 <w:noProof/>
               </w:rPr>
               <w:tab/>
-            </w:r>
-            <w:r>
-              <w:rPr>
-                <w:noProof/>
-              </w:rPr>
               <w:fldChar w:fldCharType="begin"/>
-            </w:r>
-            <w:r>
-              <w:rPr>
-                <w:noProof/>
-              </w:rPr>
               <w:instrText xml:space="preserve"> PAGEREF _Toc242623970 \h </w:instrText>
-            </w:r>
-            <w:r>
-              <w:rPr>
-                <w:noProof/>
-              </w:rPr>
-            </w:r>
-            <w:r>
-              <w:rPr>
-                <w:noProof/>
-              </w:rPr>
               <w:fldChar w:fldCharType="separate"/>
-            </w:r>
-            <w:r>
-              <w:rPr>
-                <w:noProof/>
-              </w:rPr>
               <w:t>10</w:t>
-            </w:r>
-            <w:r>
-              <w:rPr>
-                <w:noProof/>
-              </w:rPr>
               <w:fldChar w:fldCharType="end"/>
             </w:r>
           </w:hyperlink>
@@ -1701,40 +1007,10 @@
                 <w:noProof/>
               </w:rPr>
               <w:tab/>
-            </w:r>
-            <w:r>
-              <w:rPr>
-                <w:noProof/>
-              </w:rPr>
               <w:fldChar w:fldCharType="begin"/>
-            </w:r>
-            <w:r>
-              <w:rPr>
-                <w:noProof/>
-              </w:rPr>
               <w:instrText xml:space="preserve"> PAGEREF _Toc242623971 \h </w:instrText>
-            </w:r>
-            <w:r>
-              <w:rPr>
-                <w:noProof/>
-              </w:rPr>
-            </w:r>
-            <w:r>
-              <w:rPr>
-                <w:noProof/>
-              </w:rPr>
               <w:fldChar w:fldCharType="separate"/>
-            </w:r>
-            <w:r>
-              <w:rPr>
-                <w:noProof/>
-              </w:rPr>
               <w:t>12</w:t>
-            </w:r>
-            <w:r>
-              <w:rPr>
-                <w:noProof/>
-              </w:rPr>
               <w:fldChar w:fldCharType="end"/>
             </w:r>
           </w:hyperlink>
@@ -1768,40 +1044,10 @@
                 <w:noProof/>
               </w:rPr>
               <w:tab/>
-            </w:r>
-            <w:r>
-              <w:rPr>
-                <w:noProof/>
-              </w:rPr>
               <w:fldChar w:fldCharType="begin"/>
-            </w:r>
-            <w:r>
-              <w:rPr>
-                <w:noProof/>
-              </w:rPr>
               <w:instrText xml:space="preserve"> PAGEREF _Toc242623972 \h </w:instrText>
-            </w:r>
-            <w:r>
-              <w:rPr>
-                <w:noProof/>
-              </w:rPr>
-            </w:r>
-            <w:r>
-              <w:rPr>
-                <w:noProof/>
-              </w:rPr>
               <w:fldChar w:fldCharType="separate"/>
-            </w:r>
-            <w:r>
-              <w:rPr>
-                <w:noProof/>
-              </w:rPr>
               <w:t>12</w:t>
-            </w:r>
-            <w:r>
-              <w:rPr>
-                <w:noProof/>
-              </w:rPr>
               <w:fldChar w:fldCharType="end"/>
             </w:r>
           </w:hyperlink>
@@ -1835,40 +1081,10 @@
                 <w:noProof/>
               </w:rPr>
               <w:tab/>
-            </w:r>
-            <w:r>
-              <w:rPr>
-                <w:noProof/>
-              </w:rPr>
               <w:fldChar w:fldCharType="begin"/>
-            </w:r>
-            <w:r>
-              <w:rPr>
-                <w:noProof/>
-              </w:rPr>
               <w:instrText xml:space="preserve"> PAGEREF _Toc242623973 \h </w:instrText>
-            </w:r>
-            <w:r>
-              <w:rPr>
-                <w:noProof/>
-              </w:rPr>
-            </w:r>
-            <w:r>
-              <w:rPr>
-                <w:noProof/>
-              </w:rPr>
               <w:fldChar w:fldCharType="separate"/>
-            </w:r>
-            <w:r>
-              <w:rPr>
-                <w:noProof/>
-              </w:rPr>
               <w:t>12</w:t>
-            </w:r>
-            <w:r>
-              <w:rPr>
-                <w:noProof/>
-              </w:rPr>
               <w:fldChar w:fldCharType="end"/>
             </w:r>
           </w:hyperlink>
@@ -1902,40 +1118,10 @@
                 <w:noProof/>
               </w:rPr>
               <w:tab/>
-            </w:r>
-            <w:r>
-              <w:rPr>
-                <w:noProof/>
-              </w:rPr>
               <w:fldChar w:fldCharType="begin"/>
-            </w:r>
-            <w:r>
-              <w:rPr>
-                <w:noProof/>
-              </w:rPr>
               <w:instrText xml:space="preserve"> PAGEREF _Toc242623974 \h </w:instrText>
-            </w:r>
-            <w:r>
-              <w:rPr>
-                <w:noProof/>
-              </w:rPr>
-            </w:r>
-            <w:r>
-              <w:rPr>
-                <w:noProof/>
-              </w:rPr>
               <w:fldChar w:fldCharType="separate"/>
-            </w:r>
-            <w:r>
-              <w:rPr>
-                <w:noProof/>
-              </w:rPr>
               <w:t>12</w:t>
-            </w:r>
-            <w:r>
-              <w:rPr>
-                <w:noProof/>
-              </w:rPr>
               <w:fldChar w:fldCharType="end"/>
             </w:r>
           </w:hyperlink>
@@ -1969,40 +1155,10 @@
                 <w:noProof/>
               </w:rPr>
               <w:tab/>
-            </w:r>
-            <w:r>
-              <w:rPr>
-                <w:noProof/>
-              </w:rPr>
               <w:fldChar w:fldCharType="begin"/>
-            </w:r>
-            <w:r>
-              <w:rPr>
-                <w:noProof/>
-              </w:rPr>
               <w:instrText xml:space="preserve"> PAGEREF _Toc242623975 \h </w:instrText>
-            </w:r>
-            <w:r>
-              <w:rPr>
-                <w:noProof/>
-              </w:rPr>
-            </w:r>
-            <w:r>
-              <w:rPr>
-                <w:noProof/>
-              </w:rPr>
               <w:fldChar w:fldCharType="separate"/>
-            </w:r>
-            <w:r>
-              <w:rPr>
-                <w:noProof/>
-              </w:rPr>
               <w:t>13</w:t>
-            </w:r>
-            <w:r>
-              <w:rPr>
-                <w:noProof/>
-              </w:rPr>
               <w:fldChar w:fldCharType="end"/>
             </w:r>
           </w:hyperlink>
@@ -2036,40 +1192,10 @@
                 <w:noProof/>
               </w:rPr>
               <w:tab/>
-            </w:r>
-            <w:r>
-              <w:rPr>
-                <w:noProof/>
-              </w:rPr>
               <w:fldChar w:fldCharType="begin"/>
-            </w:r>
-            <w:r>
-              <w:rPr>
-                <w:noProof/>
-              </w:rPr>
               <w:instrText xml:space="preserve"> PAGEREF _Toc242623976 \h </w:instrText>
-            </w:r>
-            <w:r>
-              <w:rPr>
-                <w:noProof/>
-              </w:rPr>
-            </w:r>
-            <w:r>
-              <w:rPr>
-                <w:noProof/>
-              </w:rPr>
               <w:fldChar w:fldCharType="separate"/>
-            </w:r>
-            <w:r>
-              <w:rPr>
-                <w:noProof/>
-              </w:rPr>
               <w:t>13</w:t>
-            </w:r>
-            <w:r>
-              <w:rPr>
-                <w:noProof/>
-              </w:rPr>
               <w:fldChar w:fldCharType="end"/>
             </w:r>
           </w:hyperlink>
@@ -2103,40 +1229,10 @@
                 <w:noProof/>
               </w:rPr>
               <w:tab/>
-            </w:r>
-            <w:r>
-              <w:rPr>
-                <w:noProof/>
-              </w:rPr>
               <w:fldChar w:fldCharType="begin"/>
-            </w:r>
-            <w:r>
-              <w:rPr>
-                <w:noProof/>
-              </w:rPr>
               <w:instrText xml:space="preserve"> PAGEREF _Toc242623977 \h </w:instrText>
-            </w:r>
-            <w:r>
-              <w:rPr>
-                <w:noProof/>
-              </w:rPr>
-            </w:r>
-            <w:r>
-              <w:rPr>
-                <w:noProof/>
-              </w:rPr>
               <w:fldChar w:fldCharType="separate"/>
-            </w:r>
-            <w:r>
-              <w:rPr>
-                <w:noProof/>
-              </w:rPr>
               <w:t>14</w:t>
-            </w:r>
-            <w:r>
-              <w:rPr>
-                <w:noProof/>
-              </w:rPr>
               <w:fldChar w:fldCharType="end"/>
             </w:r>
           </w:hyperlink>
@@ -2170,40 +1266,10 @@
                 <w:noProof/>
               </w:rPr>
               <w:tab/>
-            </w:r>
-            <w:r>
-              <w:rPr>
-                <w:noProof/>
-              </w:rPr>
               <w:fldChar w:fldCharType="begin"/>
-            </w:r>
-            <w:r>
-              <w:rPr>
-                <w:noProof/>
-              </w:rPr>
               <w:instrText xml:space="preserve"> PAGEREF _Toc242623978 \h </w:instrText>
-            </w:r>
-            <w:r>
-              <w:rPr>
-                <w:noProof/>
-              </w:rPr>
-            </w:r>
-            <w:r>
-              <w:rPr>
-                <w:noProof/>
-              </w:rPr>
               <w:fldChar w:fldCharType="separate"/>
-            </w:r>
-            <w:r>
-              <w:rPr>
-                <w:noProof/>
-              </w:rPr>
               <w:t>14</w:t>
-            </w:r>
-            <w:r>
-              <w:rPr>
-                <w:noProof/>
-              </w:rPr>
               <w:fldChar w:fldCharType="end"/>
             </w:r>
           </w:hyperlink>
@@ -2237,40 +1303,10 @@
                 <w:noProof/>
               </w:rPr>
               <w:tab/>
-            </w:r>
-            <w:r>
-              <w:rPr>
-                <w:noProof/>
-              </w:rPr>
               <w:fldChar w:fldCharType="begin"/>
-            </w:r>
-            <w:r>
-              <w:rPr>
-                <w:noProof/>
-              </w:rPr>
               <w:instrText xml:space="preserve"> PAGEREF _Toc242623979 \h </w:instrText>
-            </w:r>
-            <w:r>
-              <w:rPr>
-                <w:noProof/>
-              </w:rPr>
-            </w:r>
-            <w:r>
-              <w:rPr>
-                <w:noProof/>
-              </w:rPr>
               <w:fldChar w:fldCharType="separate"/>
-            </w:r>
-            <w:r>
-              <w:rPr>
-                <w:noProof/>
-              </w:rPr>
               <w:t>14</w:t>
-            </w:r>
-            <w:r>
-              <w:rPr>
-                <w:noProof/>
-              </w:rPr>
               <w:fldChar w:fldCharType="end"/>
             </w:r>
           </w:hyperlink>
@@ -2304,40 +1340,10 @@
                 <w:noProof/>
               </w:rPr>
               <w:tab/>
-            </w:r>
-            <w:r>
-              <w:rPr>
-                <w:noProof/>
-              </w:rPr>
               <w:fldChar w:fldCharType="begin"/>
-            </w:r>
-            <w:r>
-              <w:rPr>
-                <w:noProof/>
-              </w:rPr>
               <w:instrText xml:space="preserve"> PAGEREF _Toc242623980 \h </w:instrText>
-            </w:r>
-            <w:r>
-              <w:rPr>
-                <w:noProof/>
-              </w:rPr>
-            </w:r>
-            <w:r>
-              <w:rPr>
-                <w:noProof/>
-              </w:rPr>
               <w:fldChar w:fldCharType="separate"/>
-            </w:r>
-            <w:r>
-              <w:rPr>
-                <w:noProof/>
-              </w:rPr>
               <w:t>15</w:t>
-            </w:r>
-            <w:r>
-              <w:rPr>
-                <w:noProof/>
-              </w:rPr>
               <w:fldChar w:fldCharType="end"/>
             </w:r>
           </w:hyperlink>
@@ -2371,40 +1377,10 @@
                 <w:noProof/>
               </w:rPr>
               <w:tab/>
-            </w:r>
-            <w:r>
-              <w:rPr>
-                <w:noProof/>
-              </w:rPr>
               <w:fldChar w:fldCharType="begin"/>
-            </w:r>
-            <w:r>
-              <w:rPr>
-                <w:noProof/>
-              </w:rPr>
               <w:instrText xml:space="preserve"> PAGEREF _Toc242623981 \h </w:instrText>
-            </w:r>
-            <w:r>
-              <w:rPr>
-                <w:noProof/>
-              </w:rPr>
-            </w:r>
-            <w:r>
-              <w:rPr>
-                <w:noProof/>
-              </w:rPr>
               <w:fldChar w:fldCharType="separate"/>
-            </w:r>
-            <w:r>
-              <w:rPr>
-                <w:noProof/>
-              </w:rPr>
               <w:t>15</w:t>
-            </w:r>
-            <w:r>
-              <w:rPr>
-                <w:noProof/>
-              </w:rPr>
               <w:fldChar w:fldCharType="end"/>
             </w:r>
           </w:hyperlink>
@@ -2438,40 +1414,10 @@
                 <w:noProof/>
               </w:rPr>
               <w:tab/>
-            </w:r>
-            <w:r>
-              <w:rPr>
-                <w:noProof/>
-              </w:rPr>
               <w:fldChar w:fldCharType="begin"/>
-            </w:r>
-            <w:r>
-              <w:rPr>
-                <w:noProof/>
-              </w:rPr>
               <w:instrText xml:space="preserve"> PAGEREF _Toc242623982 \h </w:instrText>
-            </w:r>
-            <w:r>
-              <w:rPr>
-                <w:noProof/>
-              </w:rPr>
-            </w:r>
-            <w:r>
-              <w:rPr>
-                <w:noProof/>
-              </w:rPr>
               <w:fldChar w:fldCharType="separate"/>
-            </w:r>
-            <w:r>
-              <w:rPr>
-                <w:noProof/>
-              </w:rPr>
               <w:t>16</w:t>
-            </w:r>
-            <w:r>
-              <w:rPr>
-                <w:noProof/>
-              </w:rPr>
               <w:fldChar w:fldCharType="end"/>
             </w:r>
           </w:hyperlink>
@@ -2505,40 +1451,10 @@
                 <w:noProof/>
               </w:rPr>
               <w:tab/>
-            </w:r>
-            <w:r>
-              <w:rPr>
-                <w:noProof/>
-              </w:rPr>
               <w:fldChar w:fldCharType="begin"/>
-            </w:r>
-            <w:r>
-              <w:rPr>
-                <w:noProof/>
-              </w:rPr>
               <w:instrText xml:space="preserve"> PAGEREF _Toc242623983 \h </w:instrText>
-            </w:r>
-            <w:r>
-              <w:rPr>
-                <w:noProof/>
-              </w:rPr>
-            </w:r>
-            <w:r>
-              <w:rPr>
-                <w:noProof/>
-              </w:rPr>
               <w:fldChar w:fldCharType="separate"/>
-            </w:r>
-            <w:r>
-              <w:rPr>
-                <w:noProof/>
-              </w:rPr>
               <w:t>17</w:t>
-            </w:r>
-            <w:r>
-              <w:rPr>
-                <w:noProof/>
-              </w:rPr>
               <w:fldChar w:fldCharType="end"/>
             </w:r>
           </w:hyperlink>
@@ -2572,40 +1488,10 @@
                 <w:noProof/>
               </w:rPr>
               <w:tab/>
-            </w:r>
-            <w:r>
-              <w:rPr>
-                <w:noProof/>
-              </w:rPr>
               <w:fldChar w:fldCharType="begin"/>
-            </w:r>
-            <w:r>
-              <w:rPr>
-                <w:noProof/>
-              </w:rPr>
               <w:instrText xml:space="preserve"> PAGEREF _Toc242623984 \h </w:instrText>
-            </w:r>
-            <w:r>
-              <w:rPr>
-                <w:noProof/>
-              </w:rPr>
-            </w:r>
-            <w:r>
-              <w:rPr>
-                <w:noProof/>
-              </w:rPr>
               <w:fldChar w:fldCharType="separate"/>
-            </w:r>
-            <w:r>
-              <w:rPr>
-                <w:noProof/>
-              </w:rPr>
               <w:t>18</w:t>
-            </w:r>
-            <w:r>
-              <w:rPr>
-                <w:noProof/>
-              </w:rPr>
               <w:fldChar w:fldCharType="end"/>
             </w:r>
           </w:hyperlink>
@@ -2639,40 +1525,10 @@
                 <w:noProof/>
               </w:rPr>
               <w:tab/>
-            </w:r>
-            <w:r>
-              <w:rPr>
-                <w:noProof/>
-              </w:rPr>
               <w:fldChar w:fldCharType="begin"/>
-            </w:r>
-            <w:r>
-              <w:rPr>
-                <w:noProof/>
-              </w:rPr>
               <w:instrText xml:space="preserve"> PAGEREF _Toc242623985 \h </w:instrText>
-            </w:r>
-            <w:r>
-              <w:rPr>
-                <w:noProof/>
-              </w:rPr>
-            </w:r>
-            <w:r>
-              <w:rPr>
-                <w:noProof/>
-              </w:rPr>
               <w:fldChar w:fldCharType="separate"/>
-            </w:r>
-            <w:r>
-              <w:rPr>
-                <w:noProof/>
-              </w:rPr>
               <w:t>18</w:t>
-            </w:r>
-            <w:r>
-              <w:rPr>
-                <w:noProof/>
-              </w:rPr>
               <w:fldChar w:fldCharType="end"/>
             </w:r>
           </w:hyperlink>
@@ -2706,40 +1562,10 @@
                 <w:noProof/>
               </w:rPr>
               <w:tab/>
-            </w:r>
-            <w:r>
-              <w:rPr>
-                <w:noProof/>
-              </w:rPr>
               <w:fldChar w:fldCharType="begin"/>
-            </w:r>
-            <w:r>
-              <w:rPr>
-                <w:noProof/>
-              </w:rPr>
               <w:instrText xml:space="preserve"> PAGEREF _Toc242623986 \h </w:instrText>
-            </w:r>
-            <w:r>
-              <w:rPr>
-                <w:noProof/>
-              </w:rPr>
-            </w:r>
-            <w:r>
-              <w:rPr>
-                <w:noProof/>
-              </w:rPr>
               <w:fldChar w:fldCharType="separate"/>
-            </w:r>
-            <w:r>
-              <w:rPr>
-                <w:noProof/>
-              </w:rPr>
               <w:t>18</w:t>
-            </w:r>
-            <w:r>
-              <w:rPr>
-                <w:noProof/>
-              </w:rPr>
               <w:fldChar w:fldCharType="end"/>
             </w:r>
           </w:hyperlink>
@@ -2773,40 +1599,10 @@
                 <w:noProof/>
               </w:rPr>
               <w:tab/>
-            </w:r>
-            <w:r>
-              <w:rPr>
-                <w:noProof/>
-              </w:rPr>
               <w:fldChar w:fldCharType="begin"/>
-            </w:r>
-            <w:r>
-              <w:rPr>
-                <w:noProof/>
-              </w:rPr>
               <w:instrText xml:space="preserve"> PAGEREF _Toc242623987 \h </w:instrText>
-            </w:r>
-            <w:r>
-              <w:rPr>
-                <w:noProof/>
-              </w:rPr>
-            </w:r>
-            <w:r>
-              <w:rPr>
-                <w:noProof/>
-              </w:rPr>
               <w:fldChar w:fldCharType="separate"/>
-            </w:r>
-            <w:r>
-              <w:rPr>
-                <w:noProof/>
-              </w:rPr>
               <w:t>19</w:t>
-            </w:r>
-            <w:r>
-              <w:rPr>
-                <w:noProof/>
-              </w:rPr>
               <w:fldChar w:fldCharType="end"/>
             </w:r>
           </w:hyperlink>
@@ -2840,40 +1636,10 @@
                 <w:noProof/>
               </w:rPr>
               <w:tab/>
-            </w:r>
-            <w:r>
-              <w:rPr>
-                <w:noProof/>
-              </w:rPr>
               <w:fldChar w:fldCharType="begin"/>
-            </w:r>
-            <w:r>
-              <w:rPr>
-                <w:noProof/>
-              </w:rPr>
               <w:instrText xml:space="preserve"> PAGEREF _Toc242623988 \h </w:instrText>
-            </w:r>
-            <w:r>
-              <w:rPr>
-                <w:noProof/>
-              </w:rPr>
-            </w:r>
-            <w:r>
-              <w:rPr>
-                <w:noProof/>
-              </w:rPr>
               <w:fldChar w:fldCharType="separate"/>
-            </w:r>
-            <w:r>
-              <w:rPr>
-                <w:noProof/>
-              </w:rPr>
               <w:t>21</w:t>
-            </w:r>
-            <w:r>
-              <w:rPr>
-                <w:noProof/>
-              </w:rPr>
               <w:fldChar w:fldCharType="end"/>
             </w:r>
           </w:hyperlink>
@@ -2907,40 +1673,10 @@
                 <w:noProof/>
               </w:rPr>
               <w:tab/>
-            </w:r>
-            <w:r>
-              <w:rPr>
-                <w:noProof/>
-              </w:rPr>
               <w:fldChar w:fldCharType="begin"/>
-            </w:r>
-            <w:r>
-              <w:rPr>
-                <w:noProof/>
-              </w:rPr>
               <w:instrText xml:space="preserve"> PAGEREF _Toc242623989 \h </w:instrText>
-            </w:r>
-            <w:r>
-              <w:rPr>
-                <w:noProof/>
-              </w:rPr>
-            </w:r>
-            <w:r>
-              <w:rPr>
-                <w:noProof/>
-              </w:rPr>
               <w:fldChar w:fldCharType="separate"/>
-            </w:r>
-            <w:r>
-              <w:rPr>
-                <w:noProof/>
-              </w:rPr>
               <w:t>21</w:t>
-            </w:r>
-            <w:r>
-              <w:rPr>
-                <w:noProof/>
-              </w:rPr>
               <w:fldChar w:fldCharType="end"/>
             </w:r>
           </w:hyperlink>
@@ -2974,40 +1710,10 @@
                 <w:noProof/>
               </w:rPr>
               <w:tab/>
-            </w:r>
-            <w:r>
-              <w:rPr>
-                <w:noProof/>
-              </w:rPr>
               <w:fldChar w:fldCharType="begin"/>
-            </w:r>
-            <w:r>
-              <w:rPr>
-                <w:noProof/>
-              </w:rPr>
               <w:instrText xml:space="preserve"> PAGEREF _Toc242623990 \h </w:instrText>
-            </w:r>
-            <w:r>
-              <w:rPr>
-                <w:noProof/>
-              </w:rPr>
-            </w:r>
-            <w:r>
-              <w:rPr>
-                <w:noProof/>
-              </w:rPr>
               <w:fldChar w:fldCharType="separate"/>
-            </w:r>
-            <w:r>
-              <w:rPr>
-                <w:noProof/>
-              </w:rPr>
               <w:t>21</w:t>
-            </w:r>
-            <w:r>
-              <w:rPr>
-                <w:noProof/>
-              </w:rPr>
               <w:fldChar w:fldCharType="end"/>
             </w:r>
           </w:hyperlink>
@@ -6302,7 +5008,7 @@
         <w:t>groene vakken</w:t>
       </w:r>
       <w:r>
-        <w:t>: de ruimtes die de tool gevonden heeft. Linksboven in elk vak staat de naam van de ruimte. Controleer of elke ruimte precies één vak heeft en of de namen kloppen.</w:t>
+        <w:t>: de ruimtes die de tool gevonden heeft. Linksboven in elk vak staat de naam van de ruimte. Controleer of elke ruimte precies één vak heeft en of de namen kloppen. Bovenaan, naast het versienummer, zie je welke tekening je open hebt (File: …); die naam staat ook in het tabblad van je browser.</w:t>
       </w:r>
     </w:p>
     <w:p>
@@ -6317,7 +5023,7 @@
         </w:rPr>
         <w:drawing>
           <wp:inline distT="0" distB="0" distL="0" distR="0" wp14:anchorId="62046C4A" wp14:editId="5EBB5003">
-            <wp:extent cx="5715000" cy="4162425"/>
+            <wp:extent cx="5715000" cy="3456653"/>
             <wp:effectExtent l="0" t="0" r="0" b="0"/>
             <wp:docPr id="9" name="04_correct.png" descr="Het correctiescherm: de werkbalk bovenaan, de gevonden ruimtes als groene vakken, de knop Export onderaan." title="Het correctiescherm: de werkbalk bovenaan, de gevonden ruimtes als groene vakken, de knop Export onderaan."/>
             <wp:cNvGraphicFramePr>
@@ -6342,7 +5048,7 @@
                   <pic:spPr bwMode="auto">
                     <a:xfrm>
                       <a:off x="0" y="0"/>
-                      <a:ext cx="5715000" cy="4162425"/>
+                      <a:ext cx="5715000" cy="3456653"/>
                     </a:xfrm>
                     <a:prstGeom prst="rect">
                       <a:avLst/>
@@ -6373,6 +5079,39 @@
     </w:p>
     <w:p>
       <w:pPr>
+        <w:pBdr>
+          <w:top w:val="single" w:sz="4" w:space="4" w:color="FFF6E9"/>
+          <w:left w:val="single" w:sz="24" w:space="8" w:color="D99A2B"/>
+        </w:pBdr>
+        <w:shd w:val="clear" w:color="auto" w:fill="FFF6E9"/>
+        <w:spacing w:before="80" w:after="40"/>
+        <w:ind w:left="200" w:right="120"/>
+      </w:pPr>
+      <w:r>
+        <w:rPr>
+          <w:b/>
+          <w:bCs/>
+          <w:color w:val="7A4E0B"/>
+        </w:rPr>
+        <w:t>Even geduld</w:t>
+      </w:r>
+    </w:p>
+    <w:p>
+      <w:pPr>
+        <w:pBdr>
+          <w:left w:val="single" w:sz="24" w:space="8" w:color="D99A2B"/>
+          <w:bottom w:val="single" w:sz="4" w:space="4" w:color="FFF6E9"/>
+        </w:pBdr>
+        <w:shd w:val="clear" w:color="auto" w:fill="FFF6E9"/>
+        <w:spacing w:after="200"/>
+        <w:ind w:left="200" w:right="120"/>
+      </w:pPr>
+      <w:r>
+        <w:t xml:space="preserve">Bij acties die even duren (de tekening openen, draaien, een draai ongedaan maken, exporteren) verschijnt rechtsboven in de tekening een draaiend rondje met een teller, bijvoorbeeld ‘Rotating... (4s)’. Zolang dat er staat, zijn de knoppen grijs en kun je even niets doen. Je hoeft niet nog eens te klikken: als het klaar is, gaat alles vanzelf weer open.</w:t>
+      </w:r>
+    </w:p>
+    <w:p>
+      <w:pPr>
         <w:pStyle w:val="Kop2"/>
       </w:pPr>
       <w:bookmarkStart w:id="30" w:name="_Toc242623978"/>
@@ -6496,7 +5235,7 @@
         </w:rPr>
         <w:drawing>
           <wp:inline distT="0" distB="0" distL="0" distR="0" wp14:anchorId="52F969F7" wp14:editId="456311A1">
-            <wp:extent cx="5715000" cy="295275"/>
+            <wp:extent cx="5715000" cy="207818"/>
             <wp:effectExtent l="0" t="0" r="0" b="0"/>
             <wp:docPr id="10" name="05_toolbar.png" descr="De werkbalk van het correctiescherm." title="De werkbalk van het correctiescherm."/>
             <wp:cNvGraphicFramePr>
@@ -6521,7 +5260,7 @@
                   <pic:spPr bwMode="auto">
                     <a:xfrm>
                       <a:off x="0" y="0"/>
-                      <a:ext cx="5715000" cy="295275"/>
+                      <a:ext cx="5715000" cy="207818"/>
                     </a:xfrm>
                     <a:prstGeom prst="rect">
                       <a:avLst/>
@@ -7043,50 +5782,42 @@
                 <w:bCs/>
                 <w:color w:val="1F4D37"/>
               </w:rPr>
-              <w:t>↶</w:t>
+              <w:t xml:space="preserve">↶ Undo</w:t>
+            </w:r>
+          </w:p>
+        </w:tc>
+        <w:tc>
+          <w:tcPr>
+            <w:tcW w:w="7338" w:type="dxa"/>
+            <w:tcBorders>
+              <w:top w:val="single" w:sz="4" w:space="0" w:color="C9D3CC"/>
+              <w:left w:val="single" w:sz="4" w:space="0" w:color="C9D3CC"/>
+              <w:bottom w:val="single" w:sz="4" w:space="0" w:color="C9D3CC"/>
+              <w:right w:val="single" w:sz="4" w:space="0" w:color="C9D3CC"/>
+            </w:tcBorders>
+            <w:tcMar>
+              <w:top w:w="70" w:type="dxa"/>
+              <w:left w:w="110" w:type="dxa"/>
+              <w:bottom w:w="70" w:type="dxa"/>
+              <w:right w:w="110" w:type="dxa"/>
+            </w:tcMar>
+          </w:tcPr>
+          <w:p>
+            <w:pPr>
+              <w:spacing w:after="40"/>
+            </w:pPr>
+            <w:r>
+              <w:t xml:space="preserve">Een stap terug. Je kunt tot 20 stappen terug. Kan ook met Ctrl+Z. Ga je met de muis op de knop staan, dan zie je welke stap hij terugdraait.</w:t>
             </w:r>
             <w:r>
               <w:rPr>
                 <w:b/>
                 <w:bCs/>
-                <w:color w:val="1F4D37"/>
-              </w:rPr>
-              <w:t xml:space="preserve"> Undo</w:t>
-            </w:r>
-          </w:p>
-        </w:tc>
-        <w:tc>
-          <w:tcPr>
-            <w:tcW w:w="7338" w:type="dxa"/>
-            <w:tcBorders>
-              <w:top w:val="single" w:sz="4" w:space="0" w:color="C9D3CC"/>
-              <w:left w:val="single" w:sz="4" w:space="0" w:color="C9D3CC"/>
-              <w:bottom w:val="single" w:sz="4" w:space="0" w:color="C9D3CC"/>
-              <w:right w:val="single" w:sz="4" w:space="0" w:color="C9D3CC"/>
-            </w:tcBorders>
-            <w:tcMar>
-              <w:top w:w="70" w:type="dxa"/>
-              <w:left w:w="110" w:type="dxa"/>
-              <w:bottom w:w="70" w:type="dxa"/>
-              <w:right w:w="110" w:type="dxa"/>
-            </w:tcMar>
-          </w:tcPr>
-          <w:p>
-            <w:pPr>
-              <w:spacing w:after="40"/>
-            </w:pPr>
-            <w:r>
-              <w:t xml:space="preserve">De laatste wijziging ongedaan maken. Alleen de allerlaatste stap; er is geen verdere geschiedenis. Kan ook met </w:t>
-            </w:r>
-            <w:r>
-              <w:rPr>
-                <w:b/>
-                <w:bCs/>
-              </w:rPr>
-              <w:t>Ctrl+Z</w:t>
-            </w:r>
-            <w:r>
-              <w:t>.</w:t>
+              </w:rPr>
+              <w:t xml:space="preserve"/>
+            </w:r>
+            <w:r>
+              <w:t/>
             </w:r>
           </w:p>
         </w:tc>
@@ -7121,54 +5852,42 @@
                 <w:bCs/>
                 <w:color w:val="1F4D37"/>
               </w:rPr>
-              <w:t>+</w:t>
-            </w:r>
-            <w:r>
-              <w:t xml:space="preserve"> / </w:t>
+              <w:t xml:space="preserve">↷ Redo</w:t>
+            </w:r>
+          </w:p>
+        </w:tc>
+        <w:tc>
+          <w:tcPr>
+            <w:tcW w:w="7338" w:type="dxa"/>
+            <w:tcBorders>
+              <w:top w:val="single" w:sz="4" w:space="0" w:color="C9D3CC"/>
+              <w:left w:val="single" w:sz="4" w:space="0" w:color="C9D3CC"/>
+              <w:bottom w:val="single" w:sz="4" w:space="0" w:color="C9D3CC"/>
+              <w:right w:val="single" w:sz="4" w:space="0" w:color="C9D3CC"/>
+            </w:tcBorders>
+            <w:tcMar>
+              <w:top w:w="70" w:type="dxa"/>
+              <w:left w:w="110" w:type="dxa"/>
+              <w:bottom w:w="70" w:type="dxa"/>
+              <w:right w:w="110" w:type="dxa"/>
+            </w:tcMar>
+          </w:tcPr>
+          <w:p>
+            <w:pPr>
+              <w:spacing w:after="40"/>
+            </w:pPr>
+            <w:r>
+              <w:t xml:space="preserve">Een teruggedraaide stap opnieuw uitvoeren. Kan ook met Ctrl+Y of Ctrl+Shift+Z. Doe je na Undo iets nieuws, dan vervalt Redo.</w:t>
             </w:r>
             <w:r>
               <w:rPr>
                 <w:b/>
                 <w:bCs/>
-                <w:color w:val="1F4D37"/>
-              </w:rPr>
-              <w:t>-</w:t>
-            </w:r>
-            <w:r>
-              <w:t xml:space="preserve"> / </w:t>
-            </w:r>
-            <w:r>
-              <w:rPr>
-                <w:b/>
-                <w:bCs/>
-                <w:color w:val="1F4D37"/>
-              </w:rPr>
-              <w:t>Fit</w:t>
-            </w:r>
-          </w:p>
-        </w:tc>
-        <w:tc>
-          <w:tcPr>
-            <w:tcW w:w="7338" w:type="dxa"/>
-            <w:tcBorders>
-              <w:top w:val="single" w:sz="4" w:space="0" w:color="C9D3CC"/>
-              <w:left w:val="single" w:sz="4" w:space="0" w:color="C9D3CC"/>
-              <w:bottom w:val="single" w:sz="4" w:space="0" w:color="C9D3CC"/>
-              <w:right w:val="single" w:sz="4" w:space="0" w:color="C9D3CC"/>
-            </w:tcBorders>
-            <w:tcMar>
-              <w:top w:w="70" w:type="dxa"/>
-              <w:left w:w="110" w:type="dxa"/>
-              <w:bottom w:w="70" w:type="dxa"/>
-              <w:right w:w="110" w:type="dxa"/>
-            </w:tcMar>
-          </w:tcPr>
-          <w:p>
-            <w:pPr>
-              <w:spacing w:after="40"/>
-            </w:pPr>
-            <w:r>
-              <w:t>Inzoomen, uitzoomen en alles in beeld.</w:t>
+              </w:rPr>
+              <w:t xml:space="preserve"/>
+            </w:r>
+            <w:r>
+              <w:t/>
             </w:r>
           </w:p>
         </w:tc>
@@ -7203,7 +5922,10 @@
                 <w:bCs/>
                 <w:color w:val="1F4D37"/>
               </w:rPr>
-              <w:t>⟳</w:t>
+              <w:t>+</w:t>
+            </w:r>
+            <w:r>
+              <w:t xml:space="preserve"> / </w:t>
             </w:r>
             <w:r>
               <w:rPr>
@@ -7211,7 +5933,78 @@
                 <w:bCs/>
                 <w:color w:val="1F4D37"/>
               </w:rPr>
-              <w:t xml:space="preserve"> Rotate</w:t>
+              <w:t>-</w:t>
+            </w:r>
+            <w:r>
+              <w:t xml:space="preserve"> / </w:t>
+            </w:r>
+            <w:r>
+              <w:rPr>
+                <w:b/>
+                <w:bCs/>
+                <w:color w:val="1F4D37"/>
+              </w:rPr>
+              <w:t>Fit</w:t>
+            </w:r>
+          </w:p>
+        </w:tc>
+        <w:tc>
+          <w:tcPr>
+            <w:tcW w:w="7338" w:type="dxa"/>
+            <w:tcBorders>
+              <w:top w:val="single" w:sz="4" w:space="0" w:color="C9D3CC"/>
+              <w:left w:val="single" w:sz="4" w:space="0" w:color="C9D3CC"/>
+              <w:bottom w:val="single" w:sz="4" w:space="0" w:color="C9D3CC"/>
+              <w:right w:val="single" w:sz="4" w:space="0" w:color="C9D3CC"/>
+            </w:tcBorders>
+            <w:tcMar>
+              <w:top w:w="70" w:type="dxa"/>
+              <w:left w:w="110" w:type="dxa"/>
+              <w:bottom w:w="70" w:type="dxa"/>
+              <w:right w:w="110" w:type="dxa"/>
+            </w:tcMar>
+          </w:tcPr>
+          <w:p>
+            <w:pPr>
+              <w:spacing w:after="40"/>
+            </w:pPr>
+            <w:r>
+              <w:t>Inzoomen, uitzoomen en alles in beeld.</w:t>
+            </w:r>
+          </w:p>
+        </w:tc>
+      </w:tr>
+      <w:tr>
+        <w:trPr>
+          <w:cantSplit/>
+        </w:trPr>
+        <w:tc>
+          <w:tcPr>
+            <w:tcW w:w="2300" w:type="dxa"/>
+            <w:tcBorders>
+              <w:top w:val="single" w:sz="4" w:space="0" w:color="C9D3CC"/>
+              <w:left w:val="single" w:sz="4" w:space="0" w:color="C9D3CC"/>
+              <w:bottom w:val="single" w:sz="4" w:space="0" w:color="C9D3CC"/>
+              <w:right w:val="single" w:sz="4" w:space="0" w:color="C9D3CC"/>
+            </w:tcBorders>
+            <w:tcMar>
+              <w:top w:w="70" w:type="dxa"/>
+              <w:left w:w="110" w:type="dxa"/>
+              <w:bottom w:w="70" w:type="dxa"/>
+              <w:right w:w="110" w:type="dxa"/>
+            </w:tcMar>
+          </w:tcPr>
+          <w:p>
+            <w:pPr>
+              <w:spacing w:after="40"/>
+            </w:pPr>
+            <w:r>
+              <w:rPr>
+                <w:b/>
+                <w:bCs/>
+                <w:color w:val="1F4D37"/>
+              </w:rPr>
+              <w:t xml:space="preserve">⟳ Rotate</w:t>
             </w:r>
           </w:p>
         </w:tc>
@@ -7340,29 +6133,7 @@
         <w:ind w:left="200" w:right="120"/>
       </w:pPr>
       <w:r>
-        <w:t xml:space="preserve">Wat je met </w:t>
-      </w:r>
-      <w:r>
-        <w:rPr>
-          <w:b/>
-          <w:bCs/>
-          <w:color w:val="1F4D37"/>
-        </w:rPr>
-        <w:t>Erase</w:t>
-      </w:r>
-      <w:r>
-        <w:t xml:space="preserve"> weghaalt, verdwijnt echt uit de tekening en uit de export. Direct daarna kun je het nog met </w:t>
-      </w:r>
-      <w:r>
-        <w:rPr>
-          <w:b/>
-          <w:bCs/>
-          <w:color w:val="1F4D37"/>
-        </w:rPr>
-        <w:t>Undo</w:t>
-      </w:r>
-      <w:r>
-        <w:t xml:space="preserve"> terugzetten, maar na een volgende wijziging niet meer. Werk dus rustig.</w:t>
+        <w:t xml:space="preserve">Wat je met Erase weghaalt, verdwijnt uit de tekening en uit de export. Met Undo zet je het terug, ook als je daarna nog andere dingen hebt gedaan (tot 20 stappen terug).</w:t>
       </w:r>
     </w:p>
     <w:p>
@@ -8321,15 +7092,7 @@
                 <w:bCs/>
                 <w:color w:val="1F4D37"/>
               </w:rPr>
-              <w:t>⟳</w:t>
-            </w:r>
-            <w:r>
-              <w:rPr>
-                <w:b/>
-                <w:bCs/>
-                <w:color w:val="1F4D37"/>
-              </w:rPr>
-              <w:t xml:space="preserve"> Rotate</w:t>
+              <w:t xml:space="preserve">⟳ Rotate</w:t>
             </w:r>
             <w:r>
               <w:t xml:space="preserve"> (90° per klik).</w:t>
@@ -8659,7 +7422,7 @@
               <w:spacing w:after="40"/>
             </w:pPr>
             <w:r>
-              <w:t>Laatste wijziging ongedaan maken</w:t>
+              <w:t xml:space="preserve">Stap terug (Undo)</w:t>
             </w:r>
           </w:p>
         </w:tc>
@@ -8684,7 +7447,62 @@
               <w:spacing w:after="40"/>
             </w:pPr>
             <w:r>
-              <w:t>Ctrl + Z</w:t>
+              <w:t xml:space="preserve">Ctrl + Z</w:t>
+            </w:r>
+          </w:p>
+        </w:tc>
+      </w:tr>
+      <w:tr>
+        <w:trPr>
+          <w:cantSplit/>
+        </w:trPr>
+        <w:tc>
+          <w:tcPr>
+            <w:tcW w:w="4000" w:type="dxa"/>
+            <w:tcBorders>
+              <w:top w:val="single" w:sz="4" w:space="0" w:color="C9D3CC"/>
+              <w:left w:val="single" w:sz="4" w:space="0" w:color="C9D3CC"/>
+              <w:bottom w:val="single" w:sz="4" w:space="0" w:color="C9D3CC"/>
+              <w:right w:val="single" w:sz="4" w:space="0" w:color="C9D3CC"/>
+            </w:tcBorders>
+            <w:tcMar>
+              <w:top w:w="70" w:type="dxa"/>
+              <w:left w:w="110" w:type="dxa"/>
+              <w:bottom w:w="70" w:type="dxa"/>
+              <w:right w:w="110" w:type="dxa"/>
+            </w:tcMar>
+          </w:tcPr>
+          <w:p>
+            <w:pPr>
+              <w:spacing w:after="40"/>
+            </w:pPr>
+            <w:r>
+              <w:t xml:space="preserve">Stap vooruit (Redo)</w:t>
+            </w:r>
+          </w:p>
+        </w:tc>
+        <w:tc>
+          <w:tcPr>
+            <w:tcW w:w="5638" w:type="dxa"/>
+            <w:tcBorders>
+              <w:top w:val="single" w:sz="4" w:space="0" w:color="C9D3CC"/>
+              <w:left w:val="single" w:sz="4" w:space="0" w:color="C9D3CC"/>
+              <w:bottom w:val="single" w:sz="4" w:space="0" w:color="C9D3CC"/>
+              <w:right w:val="single" w:sz="4" w:space="0" w:color="C9D3CC"/>
+            </w:tcBorders>
+            <w:tcMar>
+              <w:top w:w="70" w:type="dxa"/>
+              <w:left w:w="110" w:type="dxa"/>
+              <w:bottom w:w="70" w:type="dxa"/>
+              <w:right w:w="110" w:type="dxa"/>
+            </w:tcMar>
+          </w:tcPr>
+          <w:p>
+            <w:pPr>
+              <w:spacing w:after="40"/>
+            </w:pPr>
+            <w:r>
+              <w:t xml:space="preserve">Ctrl + Y of Ctrl + Shift + Z</w:t>
             </w:r>
           </w:p>
         </w:tc>
@@ -8888,7 +7706,7 @@
         <w:t>Export</w:t>
       </w:r>
       <w:r>
-        <w:t>, onder het correctievenster. Naast de knop staat even ‘Exporting...’.</w:t>
+        <w:t>, onder het correctievenster. Rechtsboven in de tekening verschijnt ‘Exporting...’ met een teller.</w:t>
       </w:r>
     </w:p>
     <w:p>
@@ -10260,6 +9078,72 @@
             </w:r>
             <w:r>
               <w:t xml:space="preserve"> lager (bijv. 3) of zet tekstherkenning (OCR) uit.</w:t>
+            </w:r>
+          </w:p>
+        </w:tc>
+      </w:tr>
+      <w:tr>
+        <w:trPr>
+          <w:cantSplit/>
+        </w:trPr>
+        <w:tc>
+          <w:tcPr>
+            <w:tcW w:w="3900" w:type="dxa"/>
+            <w:tcBorders>
+              <w:top w:val="single" w:sz="4" w:space="0" w:color="C9D3CC"/>
+              <w:left w:val="single" w:sz="4" w:space="0" w:color="C9D3CC"/>
+              <w:bottom w:val="single" w:sz="4" w:space="0" w:color="C9D3CC"/>
+              <w:right w:val="single" w:sz="4" w:space="0" w:color="C9D3CC"/>
+            </w:tcBorders>
+            <w:tcMar>
+              <w:top w:w="70" w:type="dxa"/>
+              <w:left w:w="110" w:type="dxa"/>
+              <w:bottom w:w="70" w:type="dxa"/>
+              <w:right w:w="110" w:type="dxa"/>
+            </w:tcMar>
+          </w:tcPr>
+          <w:p>
+            <w:pPr>
+              <w:spacing w:after="40"/>
+            </w:pPr>
+            <w:r>
+              <w:t xml:space="preserve">Alles is grijs en ik kan nergens op klikken.</w:t>
+            </w:r>
+          </w:p>
+        </w:tc>
+        <w:tc>
+          <w:tcPr>
+            <w:tcW w:w="5738" w:type="dxa"/>
+            <w:tcBorders>
+              <w:top w:val="single" w:sz="4" w:space="0" w:color="C9D3CC"/>
+              <w:left w:val="single" w:sz="4" w:space="0" w:color="C9D3CC"/>
+              <w:bottom w:val="single" w:sz="4" w:space="0" w:color="C9D3CC"/>
+              <w:right w:val="single" w:sz="4" w:space="0" w:color="C9D3CC"/>
+            </w:tcBorders>
+            <w:tcMar>
+              <w:top w:w="70" w:type="dxa"/>
+              <w:left w:w="110" w:type="dxa"/>
+              <w:bottom w:w="70" w:type="dxa"/>
+              <w:right w:w="110" w:type="dxa"/>
+            </w:tcMar>
+          </w:tcPr>
+          <w:p>
+            <w:pPr>
+              <w:spacing w:after="40"/>
+            </w:pPr>
+            <w:r>
+              <w:t xml:space="preserve">De tool is nog bezig; kijk naar het draaiende rondje rechtsboven in de tekening. Wacht tot het klaar is, daarna gaat alles vanzelf weer open.</w:t>
+            </w:r>
+            <w:r>
+              <w:rPr>
+                <w:b/>
+                <w:bCs/>
+                <w:color w:val="1F4D37"/>
+              </w:rPr>
+              <w:t xml:space="preserve"/>
+            </w:r>
+            <w:r>
+              <w:t xml:space="preserve"/>
             </w:r>
           </w:p>
         </w:tc>

</xml_diff>

<commit_message>
Verhoog versienummer naar 0.8.0
Ook in de handleiding (voorblad, voettekst en de twee schermafbeeldingen
met het versienummer).

Co-Authored-By: Claude Opus 5.5 <noreply@anthropic.com>
</commit_message>
<xml_diff>
--- a/docs/Floorplan Cleaner Handleiding.docx
+++ b/docs/Floorplan Cleaner Handleiding.docx
@@ -61,7 +61,7 @@
         <w:t>Versie van de tool:</w:t>
       </w:r>
       <w:r>
-        <w:t xml:space="preserve"> 0.7.0</w:t>
+        <w:t xml:space="preserve"> 0.8.0</w:t>
       </w:r>
     </w:p>
     <w:p>
@@ -9524,7 +9524,7 @@
         <w:sz w:val="16"/>
         <w:szCs w:val="16"/>
       </w:rPr>
-      <w:t>Floorplan Cleaner – handleiding (v0.7.0)</w:t>
+      <w:t>Floorplan Cleaner – handleiding (v0.8.0)</w:t>
     </w:r>
     <w:r>
       <w:rPr>

</xml_diff>